<commit_message>
Move Aufgaben files into HTML-CSS directory
Reorganize repository by moving numerous Aufgabens (PDFs, HTML, images, CSS, fonts, md) from top-level Aufgaben/... into HTML-CSS/Aufgaben/... (renamed with 100% similarity). Also update binary file JavaScript/Rechenoperatoren/Fragen.docx (content changed).
</commit_message>
<xml_diff>
--- a/JavaScript/Rechenoperatoren/Fragen.docx
+++ b/JavaScript/Rechenoperatoren/Fragen.docx
@@ -94,7 +94,21 @@
           <w:rFonts w:ascii="Comic Sans MS" w:eastAsia="Comic Sans MS" w:hAnsi="Comic Sans MS" w:cs="Comic Sans MS"/>
           <w:lang w:bidi="de-DE"/>
         </w:rPr>
-        <w:t>Klammern (): Höchste Prioritöt.</w:t>
+        <w:t xml:space="preserve">Klammern (): Höchste </w:t>
+      </w:r>
+      <w:r>
+        <w:rPr>
+          <w:rFonts w:ascii="Comic Sans MS" w:eastAsia="Comic Sans MS" w:hAnsi="Comic Sans MS" w:cs="Comic Sans MS"/>
+          <w:lang w:bidi="de-DE"/>
+        </w:rPr>
+        <w:t>Priorität</w:t>
+      </w:r>
+      <w:r>
+        <w:rPr>
+          <w:rFonts w:ascii="Comic Sans MS" w:eastAsia="Comic Sans MS" w:hAnsi="Comic Sans MS" w:cs="Comic Sans MS"/>
+          <w:lang w:bidi="de-DE"/>
+        </w:rPr>
+        <w:t>.</w:t>
       </w:r>
     </w:p>
     <w:p>
@@ -327,7 +341,13 @@
         <w:rPr>
           <w:rFonts w:ascii="Comic Sans MS" w:eastAsia="Comic Sans MS" w:hAnsi="Comic Sans MS" w:cs="Comic Sans MS"/>
         </w:rPr>
-        <w:t>Besipiel Umsatzsteuer</w:t>
+        <w:t>Beispiel</w:t>
+      </w:r>
+      <w:r>
+        <w:rPr>
+          <w:rFonts w:ascii="Comic Sans MS" w:eastAsia="Comic Sans MS" w:hAnsi="Comic Sans MS" w:cs="Comic Sans MS"/>
+        </w:rPr>
+        <w:t xml:space="preserve"> Umsatzsteuer</w:t>
       </w:r>
     </w:p>
     <w:p>
@@ -346,7 +366,31 @@
         <w:rPr>
           <w:rFonts w:ascii="Comic Sans MS" w:eastAsia="Comic Sans MS" w:hAnsi="Comic Sans MS" w:cs="Comic Sans MS"/>
         </w:rPr>
-        <w:t>Wenn man Preise im Restaurant brechnen will, kann man so machen:</w:t>
+        <w:t xml:space="preserve">Wenn man Preise im Restaurant </w:t>
+      </w:r>
+      <w:r>
+        <w:rPr>
+          <w:rFonts w:ascii="Comic Sans MS" w:eastAsia="Comic Sans MS" w:hAnsi="Comic Sans MS" w:cs="Comic Sans MS"/>
+        </w:rPr>
+        <w:t>berechnen</w:t>
+      </w:r>
+      <w:r>
+        <w:rPr>
+          <w:rFonts w:ascii="Comic Sans MS" w:eastAsia="Comic Sans MS" w:hAnsi="Comic Sans MS" w:cs="Comic Sans MS"/>
+        </w:rPr>
+        <w:t xml:space="preserve"> will, kann man </w:t>
+      </w:r>
+      <w:r>
+        <w:rPr>
+          <w:rFonts w:ascii="Comic Sans MS" w:eastAsia="Comic Sans MS" w:hAnsi="Comic Sans MS" w:cs="Comic Sans MS"/>
+        </w:rPr>
+        <w:t xml:space="preserve">es </w:t>
+      </w:r>
+      <w:r>
+        <w:rPr>
+          <w:rFonts w:ascii="Comic Sans MS" w:eastAsia="Comic Sans MS" w:hAnsi="Comic Sans MS" w:cs="Comic Sans MS"/>
+        </w:rPr>
+        <w:t>so machen:</w:t>
       </w:r>
     </w:p>
     <w:p>
@@ -357,6 +401,9 @@
         </w:rPr>
       </w:pPr>
       <w:r>
+        <w:rPr>
+          <w:noProof/>
+        </w:rPr>
         <w:drawing>
           <wp:inline distT="0" distB="0" distL="0" distR="0" wp14:anchorId="53CEFAC3" wp14:editId="4676F53D">
             <wp:extent cx="4391638" cy="1038370"/>
@@ -437,7 +484,21 @@
           <w:rFonts w:ascii="Comic Sans MS" w:eastAsia="Comic Sans MS" w:hAnsi="Comic Sans MS" w:cs="Comic Sans MS"/>
           <w:lang w:bidi="de-DE"/>
         </w:rPr>
-        <w:t>er + Operation kann in JavaScript auch Text (Strings) zusammenfügen. Das nennt man Konkatenation</w:t>
+        <w:t xml:space="preserve">er </w:t>
+      </w:r>
+      <w:r>
+        <w:rPr>
+          <w:rFonts w:ascii="Comic Sans MS" w:eastAsia="Comic Sans MS" w:hAnsi="Comic Sans MS" w:cs="Comic Sans MS"/>
+          <w:lang w:bidi="de-DE"/>
+        </w:rPr>
+        <w:t>+ Operation</w:t>
+      </w:r>
+      <w:r>
+        <w:rPr>
+          <w:rFonts w:ascii="Comic Sans MS" w:eastAsia="Comic Sans MS" w:hAnsi="Comic Sans MS" w:cs="Comic Sans MS"/>
+          <w:lang w:bidi="de-DE"/>
+        </w:rPr>
+        <w:t xml:space="preserve"> kann in JavaScript auch Text (Strings) zusammenfügen. Das nennt man Konkatenation</w:t>
       </w:r>
     </w:p>
     <w:p>
@@ -451,6 +512,7 @@
       <w:r>
         <w:rPr>
           <w:rFonts w:ascii="Comic Sans MS" w:eastAsia="Comic Sans MS" w:hAnsi="Comic Sans MS" w:cs="Comic Sans MS"/>
+          <w:noProof/>
         </w:rPr>
         <w:drawing>
           <wp:inline distT="0" distB="0" distL="0" distR="0" wp14:anchorId="315DEE97" wp14:editId="7B96F4D0">
@@ -505,7 +567,35 @@
           <w:rFonts w:ascii="Comic Sans MS" w:eastAsia="Comic Sans MS" w:hAnsi="Comic Sans MS" w:cs="Comic Sans MS"/>
           <w:lang w:bidi="de-DE"/>
         </w:rPr>
-        <w:t>Achtung: Wenn man eine Zahl und eine Text addiert (z.B. 5 + „10“), macht JavaScript darus den Text „510“</w:t>
+        <w:t xml:space="preserve">Achtung: Wenn man eine Zahl und </w:t>
+      </w:r>
+      <w:r>
+        <w:rPr>
+          <w:rFonts w:ascii="Comic Sans MS" w:eastAsia="Comic Sans MS" w:hAnsi="Comic Sans MS" w:cs="Comic Sans MS"/>
+          <w:lang w:bidi="de-DE"/>
+        </w:rPr>
+        <w:t>einen</w:t>
+      </w:r>
+      <w:r>
+        <w:rPr>
+          <w:rFonts w:ascii="Comic Sans MS" w:eastAsia="Comic Sans MS" w:hAnsi="Comic Sans MS" w:cs="Comic Sans MS"/>
+          <w:lang w:bidi="de-DE"/>
+        </w:rPr>
+        <w:t xml:space="preserve"> Text addiert (z.B. 5 + „10“), macht JavaScript </w:t>
+      </w:r>
+      <w:r>
+        <w:rPr>
+          <w:rFonts w:ascii="Comic Sans MS" w:eastAsia="Comic Sans MS" w:hAnsi="Comic Sans MS" w:cs="Comic Sans MS"/>
+          <w:lang w:bidi="de-DE"/>
+        </w:rPr>
+        <w:t>daraus</w:t>
+      </w:r>
+      <w:r>
+        <w:rPr>
+          <w:rFonts w:ascii="Comic Sans MS" w:eastAsia="Comic Sans MS" w:hAnsi="Comic Sans MS" w:cs="Comic Sans MS"/>
+          <w:lang w:bidi="de-DE"/>
+        </w:rPr>
+        <w:t xml:space="preserve"> den Text „510“</w:t>
       </w:r>
     </w:p>
     <w:p>
@@ -672,7 +762,13 @@
         <w:rPr>
           <w:rFonts w:ascii="Comic Sans MS" w:eastAsia="Comic Sans MS" w:hAnsi="Comic Sans MS" w:cs="Comic Sans MS"/>
         </w:rPr>
-        <w:t>Metoden von Math. (Potenz, uzw.)</w:t>
+        <w:t>Methoden</w:t>
+      </w:r>
+      <w:r>
+        <w:rPr>
+          <w:rFonts w:ascii="Comic Sans MS" w:eastAsia="Comic Sans MS" w:hAnsi="Comic Sans MS" w:cs="Comic Sans MS"/>
+        </w:rPr>
+        <w:t xml:space="preserve"> von Math. (Potenz, uzw.)</w:t>
       </w:r>
     </w:p>
     <w:tbl>
@@ -1107,7 +1203,19 @@
               <w:rPr>
                 <w:rFonts w:ascii="Comic Sans MS" w:hAnsi="Comic Sans MS" w:cs="Comic Sans MS"/>
               </w:rPr>
-              <w:t xml:space="preserve"> (Egal was nach dem Komma steht)</w:t>
+              <w:t xml:space="preserve"> </w:t>
+            </w:r>
+            <w:r>
+              <w:rPr>
+                <w:rFonts w:ascii="Comic Sans MS" w:hAnsi="Comic Sans MS" w:cs="Comic Sans MS"/>
+              </w:rPr>
+              <w:t>(egal,</w:t>
+            </w:r>
+            <w:r>
+              <w:rPr>
+                <w:rFonts w:ascii="Comic Sans MS" w:hAnsi="Comic Sans MS" w:cs="Comic Sans MS"/>
+              </w:rPr>
+              <w:t xml:space="preserve"> was nach dem Komma steht)</w:t>
             </w:r>
           </w:p>
         </w:tc>
@@ -1412,6 +1520,7 @@
       <w:r>
         <w:rPr>
           <w:rFonts w:ascii="Comic Sans MS" w:eastAsia="Comic Sans MS" w:hAnsi="Comic Sans MS" w:cs="Comic Sans MS"/>
+          <w:noProof/>
         </w:rPr>
         <w:drawing>
           <wp:inline distT="0" distB="0" distL="0" distR="0" wp14:anchorId="1637D484" wp14:editId="76E09980">
@@ -2335,6 +2444,7 @@
   <w:style w:type="character" w:default="1" w:styleId="DefaultParagraphFont">
     <w:name w:val="Default Paragraph Font"/>
     <w:uiPriority w:val="1"/>
+    <w:semiHidden/>
     <w:unhideWhenUsed/>
   </w:style>
   <w:style w:type="table" w:default="1" w:styleId="TableNormal">

</xml_diff>